<commit_message>
Fix: Oprava částečné anonymizace u smlouvy 32 (Liběna, Cecílie)
Problém:
- V anonymizovaném dokumentu byly chybně nahrazené texty:
  "LiběnaON_42]]" místo "[[PERSON_42]]"
  "CecílieN_44]]" místo "[[PERSON_44]]"
- Způsobovalo to chyby při deanonymizaci

Příčina:
- Anonymizátor nahradil pouze příjmení (Novotná -> ON_42]])
  místo celého jména (Liběna Novotná -> [[PERSON_42]])

Řešení:
- Manuální oprava anonymizovaného dokumentu smlouva32_anon.docx
- Nahrazení chybných textů správnými tagy
</commit_message>
<xml_diff>
--- a/smlouva32_anon.docx
+++ b/smlouva32_anon.docx
@@ -457,7 +457,7 @@
         <w:spacing w:before="100" w:after="50"/>
       </w:pPr>
       <w:r>
-        <w:t>Klientka azylového domu [[PERSON_42]] ([[BIRTH_ID_31]], utajená adresa, kontakt přes sociální pracovnici Mgr. [[PERSON_37]], [[PHONE_2]]) utekla před násilným manželem [[PERSON_43]] ([[BIRTH_ID_32]], evidován v databázi násilníků, má uložen zákaz vstupu do bytu a zákaz kontaktu dle zákona č. 135/2006 Sb.). Klientce [[PERSON_39]] bylo v minulosti opakovaně způsobeno těžké ublížení na zdraví: zlomenina čelisti, zlomeniny žeber, popáleniny 2. stupně, otřes mozku. Oběť LiběnaON_42]] má diagnostikovánu PTSD F43.1, chronickou úzkostnou poruchu F41.1 a recidivující depresivní poruchu F33.1. Je v terapii u psycholožky PhDr. [[PERSON_38]] ([[ICO_1]]). Má 3 nezletilé děti: [[PERSON_41]] ([[BIRTH_ID_22]]), [[PERSON_40]] ([[BIRTH_ID_24]]), [[PERSON_39]] ([[BIRTH_ID_33]]), které byly také svědky a oběťmi násilí. Dětem byla poskytnuta traumaterapie. OSPOD: sp. zn. OSPOD-2025-7845. Manžel je stíhán pro trestný čin týrání osoby žijící ve společném obydlí dle § 199 tr. zákoníku.</w:t>
+        <w:t>Klientka azylového domu [[PERSON_42]] ([[BIRTH_ID_31]], utajená adresa, kontakt přes sociální pracovnici Mgr. [[PERSON_37]], [[PHONE_2]]) utekla před násilným manželem [[PERSON_43]] ([[BIRTH_ID_32]], evidován v databázi násilníků, má uložen zákaz vstupu do bytu a zákaz kontaktu dle zákona č. 135/2006 Sb.). Klientce [[PERSON_39]] bylo v minulosti opakovaně způsobeno těžké ublížení na zdraví: zlomenina čelisti, zlomeniny žeber, popáleniny 2. stupně, otřes mozku. Oběť [[PERSON_42]] má diagnostikovánu PTSD F43.1, chronickou úzkostnou poruchu F41.1 a recidivující depresivní poruchu F33.1. Je v terapii u psycholožky PhDr. [[PERSON_38]] ([[ICO_1]]). Má 3 nezletilé děti: [[PERSON_41]] ([[BIRTH_ID_22]]), [[PERSON_40]] ([[BIRTH_ID_24]]), [[PERSON_39]] ([[BIRTH_ID_33]]), které byly také svědky a oběťmi násilí. Dětem byla poskytnuta traumaterapie. OSPOD: sp. zn. OSPOD-2025-7845. Manžel je stíhán pro trestný čin týrání osoby žijící ve společném obydlí dle § 199 tr. zákoníku.</w:t>
       </w:r>
     </w:p>
     <w:p>
@@ -465,7 +465,7 @@
         <w:spacing w:before="50" w:after="50"/>
       </w:pPr>
       <w:r>
-        <w:t>Klientka Ing. [[PERSON_44]] ([[BIRTH_ID_34]], utajená adresa, email: [[EMAIL_8]]) pobývá v azylovém domě již 8 měsíců s dcerou [[PERSON_47]] ([[BIRTH_ID_35]], 4 roky). Klientce [[PERSON_44]] bylo opakovaně vyhrožováno smrtí bývalým partnerem [[PERSON_46]] ([[BIRTH_ID_36]], má zákaz přiblížení do 500 m, monitorován elektronickým náramkem). Oběť CecílieN_44]] má diagnostikovánu těžkou depresivní epizodu F32.2, sebezraňovací chování a měla 2 pokusy o sebevraždu (2024). Je v psychiatrické péči MUDr. [[PERSON_45]], Ph.D. (registrace ČLK: 67890). Farmakoterapie: Escitalopram 20mg, Quetiapin 200mg. Sociální pracovnice pomáhá s nalezením zaměstnání a bydlení. Je žadatelkou o sociální bydlení.</w:t>
+        <w:t>Klientka Ing. [[PERSON_44]] ([[BIRTH_ID_34]], utajená adresa, email: [[EMAIL_8]]) pobývá v azylovém domě již 8 měsíců s dcerou [[PERSON_47]] ([[BIRTH_ID_35]], 4 roky). Klientce [[PERSON_44]] bylo opakovaně vyhrožováno smrtí bývalým partnerem [[PERSON_46]] ([[BIRTH_ID_36]], má zákaz přiblížení do 500 m, monitorován elektronickým náramkem). Oběť [[PERSON_44]] má diagnostikovánu těžkou depresivní epizodu F32.2, sebezraňovací chování a měla 2 pokusy o sebevraždu (2024). Je v psychiatrické péči MUDr. [[PERSON_45]], Ph.D. (registrace ČLK: 67890). Farmakoterapie: Escitalopram 20mg, Quetiapin 200mg. Sociální pracovnice pomáhá s nalezením zaměstnání a bydlení. Je žadatelkou o sociální bydlení.</w:t>
       </w:r>
     </w:p>
     <w:p>

</xml_diff>